<commit_message>
Add Brazilian Portuguese templates in various formats
- Added DOCX templates in pt-br
- Added Markdown templates in pt-br
- Added ODT templates in pt-br
</commit_message>
<xml_diff>
--- a/static/downloads/de/docx/INDEX.docx
+++ b/static/downloads/de/docx/INDEX.docx
@@ -30,7 +30,7 @@
         <w:t xml:space="preserve"> </w:t>
       </w:r>
       <w:r>
-        <w:t xml:space="preserve">2026-04-29</w:t>
+        <w:t xml:space="preserve">2026-06-26</w:t>
       </w:r>
     </w:p>
     <w:p>
@@ -57,7 +57,7 @@
             <w:rPr>
               <w:rStyle w:val="Hyperlink"/>
             </w:rPr>
-            <w:t xml:space="preserve">https://blueprint.ecohubs.community/de/articles/rcos-templates</w:t>
+            <w:t xml:space="preserve">https://rcos.ecohubs.community/de/articles/rcos-templates</w:t>
           </w:r>
         </w:hyperlink>
       </w:hyperlink>

</xml_diff>